<commit_message>
feat: local changes 2026-07-24
Co-Authored-By: Claude <noreply@anthropic.com>
</commit_message>
<xml_diff>
--- a/water-erp/apps/api/模板文件/邀请招标模板.docx
+++ b/water-erp/apps/api/模板文件/邀请招标模板.docx
@@ -444,7 +444,6 @@
         </w:rPr>
         <w:t>{{</w:t>
       </w:r>
-      <w:proofErr w:type="spellStart"/>
       <w:r>
         <w:rPr>
           <w:rFonts w:ascii="Times New Roman" w:eastAsia="黑体" w:hAnsi="Times New Roman" w:cs="Times New Roman"/>
@@ -453,7 +452,6 @@
         </w:rPr>
         <w:t>封面时间</w:t>
       </w:r>
-      <w:proofErr w:type="spellEnd"/>
       <w:r>
         <w:rPr>
           <w:rFonts w:ascii="Times New Roman" w:eastAsia="黑体" w:hAnsi="Times New Roman" w:cs="Times New Roman"/>
@@ -2876,7 +2874,6 @@
       <w:bookmarkStart w:id="5" w:name="_Toc24743"/>
       <w:bookmarkStart w:id="6" w:name="_Toc29642"/>
       <w:bookmarkStart w:id="7" w:name="_Toc230613774"/>
-      <w:proofErr w:type="spellStart"/>
       <w:r>
         <w:rPr>
           <w:rFonts w:ascii="Times New Roman" w:eastAsia="仿宋" w:hAnsi="Times New Roman" w:cs="Times New Roman"/>
@@ -2896,7 +2893,6 @@
       <w:bookmarkEnd w:id="5"/>
       <w:bookmarkEnd w:id="6"/>
       <w:bookmarkEnd w:id="7"/>
-      <w:proofErr w:type="spellEnd"/>
     </w:p>
     <w:p>
       <w:pPr>
@@ -3504,40 +3500,19 @@
         </w:rPr>
         <w:t>网站（</w:t>
       </w:r>
-      <w:r>
-        <w:fldChar w:fldCharType="begin"/>
-      </w:r>
-      <w:r>
-        <w:rPr>
-          <w:lang w:eastAsia="zh-CN"/>
-        </w:rPr>
-        <w:instrText xml:space="preserve"> HYPERLINK "https://www.gsxt.gov.cn" </w:instrText>
-      </w:r>
-      <w:r>
-        <w:fldChar w:fldCharType="separate"/>
-      </w:r>
-      <w:r>
-        <w:rPr>
-          <w:rFonts w:ascii="Times New Roman" w:eastAsia="仿宋" w:hAnsi="Times New Roman" w:cs="Times New Roman"/>
-          <w:snapToGrid/>
-          <w:color w:val="000000" w:themeColor="text1"/>
-          <w:sz w:val="24"/>
-          <w:szCs w:val="24"/>
-          <w:lang w:val="zh-CN" w:eastAsia="zh-CN"/>
-        </w:rPr>
-        <w:t>www.gsxt.gov.cn</w:t>
-      </w:r>
-      <w:r>
-        <w:rPr>
-          <w:rFonts w:ascii="Times New Roman" w:eastAsia="仿宋" w:hAnsi="Times New Roman" w:cs="Times New Roman"/>
-          <w:snapToGrid/>
-          <w:color w:val="000000" w:themeColor="text1"/>
-          <w:sz w:val="24"/>
-          <w:szCs w:val="24"/>
-          <w:lang w:val="zh-CN" w:eastAsia="zh-CN"/>
-        </w:rPr>
-        <w:fldChar w:fldCharType="end"/>
-      </w:r>
+      <w:hyperlink r:id="rId12" w:history="1">
+        <w:r>
+          <w:rPr>
+            <w:rFonts w:ascii="Times New Roman" w:eastAsia="仿宋" w:hAnsi="Times New Roman" w:cs="Times New Roman"/>
+            <w:snapToGrid/>
+            <w:color w:val="000000" w:themeColor="text1"/>
+            <w:sz w:val="24"/>
+            <w:szCs w:val="24"/>
+            <w:lang w:val="zh-CN" w:eastAsia="zh-CN"/>
+          </w:rPr>
+          <w:t>www.gsxt.gov.cn</w:t>
+        </w:r>
+      </w:hyperlink>
       <w:r>
         <w:rPr>
           <w:rFonts w:ascii="Times New Roman" w:eastAsia="仿宋" w:hAnsi="Times New Roman" w:cs="Times New Roman"/>
@@ -9266,14 +9241,14 @@
         <w:jc w:val="center"/>
         <w:outlineLvl w:val="1"/>
         <w:rPr>
-          <w:rFonts w:ascii="Times New Roman" w:eastAsia="STZhongsong" w:hAnsi="Times New Roman" w:cs="Times New Roman"/>
+          <w:rFonts w:ascii="Times New Roman" w:eastAsia="华文中宋" w:hAnsi="Times New Roman" w:cs="Times New Roman"/>
           <w:color w:val="auto"/>
           <w:sz w:val="32"/>
           <w:szCs w:val="32"/>
           <w:lang w:eastAsia="zh-CN"/>
         </w:rPr>
         <w:sectPr>
-          <w:footerReference w:type="default" r:id="rId12"/>
+          <w:footerReference w:type="default" r:id="rId13"/>
           <w:type w:val="continuous"/>
           <w:pgSz w:w="11907" w:h="16840"/>
           <w:pgMar w:top="1440" w:right="1800" w:bottom="1440" w:left="1800" w:header="862" w:footer="886" w:gutter="0"/>
@@ -16109,7 +16084,6 @@
             <w:bookmarkStart w:id="170" w:name="_Toc2458"/>
             <w:bookmarkStart w:id="171" w:name="_Toc1876"/>
             <w:bookmarkStart w:id="172" w:name="_Toc3495"/>
-            <w:proofErr w:type="spellStart"/>
             <w:r>
               <w:rPr>
                 <w:rFonts w:ascii="Times New Roman" w:eastAsia="仿宋" w:hAnsi="Times New Roman" w:cs="Times New Roman"/>
@@ -16122,7 +16096,6 @@
               </w:rPr>
               <w:t>序号</w:t>
             </w:r>
-            <w:proofErr w:type="spellEnd"/>
           </w:p>
         </w:tc>
         <w:tc>
@@ -16141,7 +16114,6 @@
                 <w:szCs w:val="24"/>
               </w:rPr>
             </w:pPr>
-            <w:proofErr w:type="spellStart"/>
             <w:r>
               <w:rPr>
                 <w:rFonts w:ascii="Times New Roman" w:eastAsia="仿宋" w:hAnsi="Times New Roman" w:cs="Times New Roman"/>
@@ -16154,7 +16126,6 @@
               </w:rPr>
               <w:t>审查因素</w:t>
             </w:r>
-            <w:proofErr w:type="spellEnd"/>
           </w:p>
         </w:tc>
         <w:tc>
@@ -16173,7 +16144,6 @@
                 <w:szCs w:val="24"/>
               </w:rPr>
             </w:pPr>
-            <w:proofErr w:type="spellStart"/>
             <w:r>
               <w:rPr>
                 <w:rFonts w:ascii="Times New Roman" w:eastAsia="仿宋" w:hAnsi="Times New Roman" w:cs="Times New Roman"/>
@@ -16186,7 +16156,6 @@
               </w:rPr>
               <w:t>审查内容</w:t>
             </w:r>
-            <w:proofErr w:type="spellEnd"/>
           </w:p>
         </w:tc>
         <w:tc>
@@ -17628,40 +17597,19 @@
               </w:rPr>
               <w:t>统网站（</w:t>
             </w:r>
-            <w:r>
-              <w:fldChar w:fldCharType="begin"/>
-            </w:r>
-            <w:r>
-              <w:rPr>
-                <w:lang w:eastAsia="zh-CN"/>
-              </w:rPr>
-              <w:instrText xml:space="preserve"> HYPERLINK "https://www.gsxt.gov.cn" </w:instrText>
-            </w:r>
-            <w:r>
-              <w:fldChar w:fldCharType="separate"/>
-            </w:r>
-            <w:r>
-              <w:rPr>
-                <w:rFonts w:ascii="Times New Roman" w:eastAsia="仿宋" w:hAnsi="Times New Roman" w:cs="Times New Roman"/>
-                <w:color w:val="000000" w:themeColor="text1"/>
-                <w:spacing w:val="5"/>
-                <w:sz w:val="24"/>
-                <w:szCs w:val="24"/>
-                <w:lang w:eastAsia="zh-CN"/>
-              </w:rPr>
-              <w:t>www.gsxt.gov.cn</w:t>
-            </w:r>
-            <w:r>
-              <w:rPr>
-                <w:rFonts w:ascii="Times New Roman" w:eastAsia="仿宋" w:hAnsi="Times New Roman" w:cs="Times New Roman"/>
-                <w:color w:val="000000" w:themeColor="text1"/>
-                <w:spacing w:val="5"/>
-                <w:sz w:val="24"/>
-                <w:szCs w:val="24"/>
-                <w:lang w:eastAsia="zh-CN"/>
-              </w:rPr>
-              <w:fldChar w:fldCharType="end"/>
-            </w:r>
+            <w:hyperlink r:id="rId14" w:history="1">
+              <w:r>
+                <w:rPr>
+                  <w:rFonts w:ascii="Times New Roman" w:eastAsia="仿宋" w:hAnsi="Times New Roman" w:cs="Times New Roman"/>
+                  <w:color w:val="000000" w:themeColor="text1"/>
+                  <w:spacing w:val="5"/>
+                  <w:sz w:val="24"/>
+                  <w:szCs w:val="24"/>
+                  <w:lang w:eastAsia="zh-CN"/>
+                </w:rPr>
+                <w:t>www.gsxt.gov.cn</w:t>
+              </w:r>
+            </w:hyperlink>
             <w:r>
               <w:rPr>
                 <w:rFonts w:ascii="Times New Roman" w:eastAsia="仿宋" w:hAnsi="Times New Roman" w:cs="Times New Roman"/>
@@ -17998,37 +17946,19 @@
               </w:rPr>
               <w:t>查询渠道：信用中国网站（</w:t>
             </w:r>
-            <w:r>
-              <w:fldChar w:fldCharType="begin"/>
-            </w:r>
-            <w:r>
-              <w:instrText xml:space="preserve"> HYPERLINK "https://www.creditchina.gov.cn" </w:instrText>
-            </w:r>
-            <w:r>
-              <w:fldChar w:fldCharType="separate"/>
-            </w:r>
-            <w:r>
-              <w:rPr>
-                <w:rFonts w:ascii="Times New Roman" w:eastAsia="仿宋" w:hAnsi="Times New Roman" w:cs="Times New Roman"/>
-                <w:color w:val="000000" w:themeColor="text1"/>
-                <w:spacing w:val="5"/>
-                <w:sz w:val="24"/>
-                <w:szCs w:val="24"/>
-                <w:lang w:eastAsia="zh-CN"/>
-              </w:rPr>
-              <w:t>www.creditchina.gov.cn</w:t>
-            </w:r>
-            <w:r>
-              <w:rPr>
-                <w:rFonts w:ascii="Times New Roman" w:eastAsia="仿宋" w:hAnsi="Times New Roman" w:cs="Times New Roman"/>
-                <w:color w:val="000000" w:themeColor="text1"/>
-                <w:spacing w:val="5"/>
-                <w:sz w:val="24"/>
-                <w:szCs w:val="24"/>
-                <w:lang w:eastAsia="zh-CN"/>
-              </w:rPr>
-              <w:fldChar w:fldCharType="end"/>
-            </w:r>
+            <w:hyperlink r:id="rId15" w:history="1">
+              <w:r>
+                <w:rPr>
+                  <w:rFonts w:ascii="Times New Roman" w:eastAsia="仿宋" w:hAnsi="Times New Roman" w:cs="Times New Roman"/>
+                  <w:color w:val="000000" w:themeColor="text1"/>
+                  <w:spacing w:val="5"/>
+                  <w:sz w:val="24"/>
+                  <w:szCs w:val="24"/>
+                  <w:lang w:eastAsia="zh-CN"/>
+                </w:rPr>
+                <w:t>www.creditchina.gov.cn</w:t>
+              </w:r>
+            </w:hyperlink>
             <w:r>
               <w:rPr>
                 <w:rFonts w:ascii="Times New Roman" w:eastAsia="仿宋" w:hAnsi="Times New Roman" w:cs="Times New Roman"/>
@@ -21422,7 +21352,6 @@
                 <w:rFonts w:ascii="Times New Roman" w:hAnsi="Times New Roman" w:cs="Times New Roman"/>
               </w:rPr>
             </w:pPr>
-            <w:proofErr w:type="spellStart"/>
             <w:r>
               <w:rPr>
                 <w:rFonts w:ascii="Times New Roman" w:eastAsia="宋体" w:hAnsi="Times New Roman" w:cs="Times New Roman"/>
@@ -21432,7 +21361,6 @@
               </w:rPr>
               <w:t>序号</w:t>
             </w:r>
-            <w:proofErr w:type="spellEnd"/>
           </w:p>
         </w:tc>
         <w:tc>
@@ -21450,7 +21378,6 @@
                 <w:rFonts w:ascii="Times New Roman" w:hAnsi="Times New Roman" w:cs="Times New Roman"/>
               </w:rPr>
             </w:pPr>
-            <w:proofErr w:type="spellStart"/>
             <w:r>
               <w:rPr>
                 <w:rFonts w:ascii="Times New Roman" w:eastAsia="宋体" w:hAnsi="Times New Roman" w:cs="Times New Roman"/>
@@ -21460,7 +21387,6 @@
               </w:rPr>
               <w:t>评分因素</w:t>
             </w:r>
-            <w:proofErr w:type="spellEnd"/>
           </w:p>
         </w:tc>
         <w:tc>
@@ -21478,7 +21404,6 @@
                 <w:rFonts w:ascii="Times New Roman" w:hAnsi="Times New Roman" w:cs="Times New Roman"/>
               </w:rPr>
             </w:pPr>
-            <w:proofErr w:type="spellStart"/>
             <w:r>
               <w:rPr>
                 <w:rFonts w:ascii="Times New Roman" w:eastAsia="宋体" w:hAnsi="Times New Roman" w:cs="Times New Roman"/>
@@ -21488,7 +21413,6 @@
               </w:rPr>
               <w:t>分值</w:t>
             </w:r>
-            <w:proofErr w:type="spellEnd"/>
           </w:p>
         </w:tc>
         <w:tc>
@@ -21506,7 +21430,6 @@
                 <w:rFonts w:ascii="Times New Roman" w:hAnsi="Times New Roman" w:cs="Times New Roman"/>
               </w:rPr>
             </w:pPr>
-            <w:proofErr w:type="spellStart"/>
             <w:r>
               <w:rPr>
                 <w:rFonts w:ascii="Times New Roman" w:eastAsia="宋体" w:hAnsi="Times New Roman" w:cs="Times New Roman"/>
@@ -21516,7 +21439,6 @@
               </w:rPr>
               <w:t>评分标准</w:t>
             </w:r>
-            <w:proofErr w:type="spellEnd"/>
           </w:p>
         </w:tc>
         <w:tc>
@@ -21534,7 +21456,6 @@
                 <w:rFonts w:ascii="Times New Roman" w:hAnsi="Times New Roman" w:cs="Times New Roman"/>
               </w:rPr>
             </w:pPr>
-            <w:proofErr w:type="spellStart"/>
             <w:r>
               <w:rPr>
                 <w:rFonts w:ascii="Times New Roman" w:eastAsia="宋体" w:hAnsi="Times New Roman" w:cs="Times New Roman"/>
@@ -21544,7 +21465,6 @@
               </w:rPr>
               <w:t>说明</w:t>
             </w:r>
-            <w:proofErr w:type="spellEnd"/>
           </w:p>
         </w:tc>
       </w:tr>
@@ -21793,7 +21713,6 @@
                 <w:rFonts w:ascii="Times New Roman" w:hAnsi="Times New Roman" w:cs="Times New Roman"/>
               </w:rPr>
             </w:pPr>
-            <w:proofErr w:type="spellStart"/>
             <w:r>
               <w:rPr>
                 <w:rFonts w:ascii="Times New Roman" w:eastAsia="宋体" w:hAnsi="Times New Roman" w:cs="Times New Roman"/>
@@ -21801,7 +21720,6 @@
               </w:rPr>
               <w:t>合计</w:t>
             </w:r>
-            <w:proofErr w:type="spellEnd"/>
           </w:p>
         </w:tc>
         <w:tc>
@@ -21839,7 +21757,7 @@
       <w:pPr>
         <w:ind w:left="720"/>
         <w:rPr>
-          <w:rFonts w:ascii="Times New Roman" w:eastAsia="STZhongsong" w:hAnsi="Times New Roman" w:cs="Times New Roman"/>
+          <w:rFonts w:ascii="Times New Roman" w:eastAsia="华文中宋" w:hAnsi="Times New Roman" w:cs="Times New Roman"/>
           <w:b/>
           <w:bCs/>
           <w:color w:val="auto"/>
@@ -21854,7 +21772,7 @@
       <w:bookmarkStart w:id="200" w:name="_Toc12794"/>
       <w:r>
         <w:rPr>
-          <w:rFonts w:ascii="Times New Roman" w:eastAsia="STZhongsong" w:hAnsi="Times New Roman" w:cs="Times New Roman"/>
+          <w:rFonts w:ascii="Times New Roman" w:eastAsia="华文中宋" w:hAnsi="Times New Roman" w:cs="Times New Roman"/>
           <w:b/>
           <w:bCs/>
           <w:color w:val="auto"/>
@@ -22257,7 +22175,7 @@
           <w:lang w:eastAsia="zh-CN"/>
         </w:rPr>
         <w:sectPr>
-          <w:footerReference w:type="default" r:id="rId13"/>
+          <w:footerReference w:type="default" r:id="rId16"/>
           <w:type w:val="continuous"/>
           <w:pgSz w:w="11907" w:h="16840"/>
           <w:pgMar w:top="1440" w:right="1800" w:bottom="1440" w:left="1800" w:header="0" w:footer="818" w:gutter="0"/>
@@ -24998,8 +24916,8 @@
           <w:lang w:eastAsia="zh-CN"/>
         </w:rPr>
         <w:sectPr>
-          <w:headerReference w:type="default" r:id="rId14"/>
-          <w:footerReference w:type="default" r:id="rId15"/>
+          <w:headerReference w:type="default" r:id="rId17"/>
+          <w:footerReference w:type="default" r:id="rId18"/>
           <w:type w:val="continuous"/>
           <w:pgSz w:w="11906" w:h="16839"/>
           <w:pgMar w:top="1440" w:right="1800" w:bottom="1440" w:left="1800" w:header="1090" w:footer="932" w:gutter="0"/>
@@ -25105,7 +25023,6 @@
         </w:rPr>
         <w:t xml:space="preserve">. </w:t>
       </w:r>
-      <w:proofErr w:type="spellStart"/>
       <w:r>
         <w:rPr>
           <w:rFonts w:ascii="Times New Roman" w:eastAsia="宋体" w:hAnsi="Times New Roman" w:cs="Times New Roman"/>
@@ -25114,7 +25031,7 @@
         </w:rPr>
         <w:t>在国家企业信用信息公示系统（</w:t>
       </w:r>
-      <w:hyperlink r:id="rId16" w:history="1">
+      <w:hyperlink r:id="rId19" w:history="1">
         <w:r>
           <w:rPr>
             <w:rFonts w:ascii="Times New Roman" w:eastAsia="Times New Roman" w:hAnsi="Times New Roman" w:cs="Times New Roman"/>
@@ -25148,17 +25065,7 @@
           <w:sz w:val="24"/>
           <w:szCs w:val="24"/>
         </w:rPr>
-        <w:t>名单页面截图</w:t>
-      </w:r>
-      <w:proofErr w:type="spellEnd"/>
-      <w:r>
-        <w:rPr>
-          <w:rFonts w:ascii="Times New Roman" w:eastAsia="宋体" w:hAnsi="Times New Roman" w:cs="Times New Roman"/>
-          <w:spacing w:val="-2"/>
-          <w:sz w:val="24"/>
-          <w:szCs w:val="24"/>
-        </w:rPr>
-        <w:t>。</w:t>
+        <w:t>名单页面截图。</w:t>
       </w:r>
     </w:p>
     <w:p>
@@ -25171,7 +25078,6 @@
           <w:szCs w:val="24"/>
         </w:rPr>
       </w:pPr>
-      <w:proofErr w:type="gramStart"/>
       <w:r>
         <w:rPr>
           <w:rFonts w:ascii="Times New Roman" w:eastAsia="Times New Roman" w:hAnsi="Times New Roman" w:cs="Times New Roman"/>
@@ -25196,17 +25102,7 @@
           <w:szCs w:val="24"/>
           <w:lang w:eastAsia="zh-CN"/>
         </w:rPr>
-        <w:t>.</w:t>
-      </w:r>
-      <w:proofErr w:type="gramEnd"/>
-      <w:r>
-        <w:rPr>
-          <w:rFonts w:ascii="Times New Roman" w:eastAsia="宋体" w:hAnsi="Times New Roman" w:cs="Times New Roman"/>
-          <w:sz w:val="24"/>
-          <w:szCs w:val="24"/>
-          <w:lang w:eastAsia="zh-CN"/>
-        </w:rPr>
-        <w:t xml:space="preserve"> </w:t>
+        <w:t xml:space="preserve">. </w:t>
       </w:r>
       <w:r>
         <w:rPr>
@@ -25234,7 +25130,7 @@
         </w:rPr>
         <w:t>（</w:t>
       </w:r>
-      <w:hyperlink r:id="rId17" w:history="1">
+      <w:hyperlink r:id="rId20" w:history="1">
         <w:r>
           <w:rPr>
             <w:rFonts w:ascii="Times New Roman" w:eastAsia="Times New Roman" w:hAnsi="Times New Roman" w:cs="Times New Roman"/>
@@ -25287,8 +25183,8 @@
           <w:szCs w:val="24"/>
         </w:rPr>
         <w:sectPr>
-          <w:headerReference w:type="default" r:id="rId18"/>
-          <w:footerReference w:type="default" r:id="rId19"/>
+          <w:headerReference w:type="default" r:id="rId21"/>
+          <w:footerReference w:type="default" r:id="rId22"/>
           <w:type w:val="continuous"/>
           <w:pgSz w:w="11906" w:h="16839"/>
           <w:pgMar w:top="1440" w:right="1800" w:bottom="1440" w:left="1800" w:header="1090" w:footer="932" w:gutter="0"/>
@@ -25363,7 +25259,7 @@
         </w:rPr>
         <w:t>(</w:t>
       </w:r>
-      <w:hyperlink r:id="rId20" w:history="1">
+      <w:hyperlink r:id="rId23" w:history="1">
         <w:r>
           <w:rPr>
             <w:rFonts w:ascii="Times New Roman" w:eastAsia="宋体" w:hAnsi="Times New Roman" w:cs="Times New Roman"/>
@@ -25427,7 +25323,7 @@
           <w:lang w:eastAsia="zh-CN"/>
         </w:rPr>
         <w:sectPr>
-          <w:footerReference w:type="default" r:id="rId21"/>
+          <w:footerReference w:type="default" r:id="rId24"/>
           <w:type w:val="continuous"/>
           <w:pgSz w:w="11906" w:h="16839"/>
           <w:pgMar w:top="1440" w:right="1800" w:bottom="1440" w:left="1800" w:header="1090" w:footer="932" w:gutter="0"/>
@@ -25511,7 +25407,7 @@
           <w:lang w:eastAsia="zh-CN"/>
         </w:rPr>
         <w:sectPr>
-          <w:footerReference w:type="default" r:id="rId22"/>
+          <w:footerReference w:type="default" r:id="rId25"/>
           <w:type w:val="continuous"/>
           <w:pgSz w:w="11906" w:h="16839"/>
           <w:pgMar w:top="1440" w:right="1800" w:bottom="1440" w:left="1800" w:header="1090" w:footer="932" w:gutter="0"/>
@@ -26003,7 +25899,6 @@
                 <w:szCs w:val="24"/>
               </w:rPr>
             </w:pPr>
-            <w:proofErr w:type="spellStart"/>
             <w:r>
               <w:rPr>
                 <w:rFonts w:ascii="Times New Roman" w:eastAsia="宋体" w:hAnsi="Times New Roman" w:cs="Times New Roman"/>
@@ -26013,7 +25908,6 @@
               </w:rPr>
               <w:t>序号</w:t>
             </w:r>
-            <w:proofErr w:type="spellEnd"/>
           </w:p>
         </w:tc>
         <w:tc>
@@ -26031,7 +25925,6 @@
                 <w:szCs w:val="24"/>
               </w:rPr>
             </w:pPr>
-            <w:proofErr w:type="spellStart"/>
             <w:r>
               <w:rPr>
                 <w:rFonts w:ascii="Times New Roman" w:eastAsia="宋体" w:hAnsi="Times New Roman" w:cs="Times New Roman"/>
@@ -26041,7 +25934,6 @@
               </w:rPr>
               <w:t>单位名称</w:t>
             </w:r>
-            <w:proofErr w:type="spellEnd"/>
           </w:p>
         </w:tc>
         <w:tc>
@@ -26059,7 +25951,6 @@
                 <w:szCs w:val="24"/>
               </w:rPr>
             </w:pPr>
-            <w:proofErr w:type="spellStart"/>
             <w:r>
               <w:rPr>
                 <w:rFonts w:ascii="Times New Roman" w:eastAsia="宋体" w:hAnsi="Times New Roman" w:cs="Times New Roman"/>
@@ -26069,7 +25960,6 @@
               </w:rPr>
               <w:t>相互关系</w:t>
             </w:r>
-            <w:proofErr w:type="spellEnd"/>
           </w:p>
         </w:tc>
       </w:tr>
@@ -26342,8 +26232,8 @@
           <w:lang w:eastAsia="zh-CN"/>
         </w:rPr>
         <w:sectPr>
-          <w:headerReference w:type="default" r:id="rId23"/>
-          <w:footerReference w:type="default" r:id="rId24"/>
+          <w:headerReference w:type="default" r:id="rId26"/>
+          <w:footerReference w:type="default" r:id="rId27"/>
           <w:type w:val="continuous"/>
           <w:pgSz w:w="11906" w:h="16839"/>
           <w:pgMar w:top="1440" w:right="1800" w:bottom="1440" w:left="1800" w:header="1090" w:footer="932" w:gutter="0"/>
@@ -26487,8 +26377,8 @@
           <w:lang w:eastAsia="zh-CN"/>
         </w:rPr>
         <w:sectPr>
-          <w:headerReference w:type="default" r:id="rId25"/>
-          <w:footerReference w:type="default" r:id="rId26"/>
+          <w:headerReference w:type="default" r:id="rId28"/>
+          <w:footerReference w:type="default" r:id="rId29"/>
           <w:type w:val="continuous"/>
           <w:pgSz w:w="11906" w:h="16839"/>
           <w:pgMar w:top="1440" w:right="1800" w:bottom="1440" w:left="1800" w:header="1090" w:footer="932" w:gutter="0"/>
@@ -27839,8 +27729,8 @@
           <w:lang w:eastAsia="zh-CN"/>
         </w:rPr>
         <w:sectPr>
-          <w:headerReference w:type="default" r:id="rId27"/>
-          <w:footerReference w:type="default" r:id="rId28"/>
+          <w:headerReference w:type="default" r:id="rId30"/>
+          <w:footerReference w:type="default" r:id="rId31"/>
           <w:type w:val="continuous"/>
           <w:pgSz w:w="11906" w:h="16839"/>
           <w:pgMar w:top="1440" w:right="1800" w:bottom="1440" w:left="1800" w:header="1090" w:footer="932" w:gutter="0"/>
@@ -28610,8 +28500,8 @@
           <w:lang w:eastAsia="zh-CN"/>
         </w:rPr>
         <w:sectPr>
-          <w:headerReference w:type="default" r:id="rId29"/>
-          <w:footerReference w:type="default" r:id="rId30"/>
+          <w:headerReference w:type="default" r:id="rId32"/>
+          <w:footerReference w:type="default" r:id="rId33"/>
           <w:type w:val="continuous"/>
           <w:pgSz w:w="11906" w:h="16839"/>
           <w:pgMar w:top="1440" w:right="1800" w:bottom="1440" w:left="1800" w:header="1090" w:footer="932" w:gutter="0"/>
@@ -29237,38 +29127,6 @@
           <w:lang w:eastAsia="zh-CN"/>
         </w:rPr>
       </w:pPr>
-    </w:p>
-    <w:p>
-      <w:pPr>
-        <w:spacing w:line="360" w:lineRule="auto"/>
-        <w:ind w:hanging="4"/>
-        <w:rPr>
-          <w:rFonts w:ascii="Times New Roman" w:eastAsia="宋体" w:hAnsi="Times New Roman" w:cs="Times New Roman"/>
-          <w:sz w:val="24"/>
-          <w:szCs w:val="24"/>
-          <w:lang w:eastAsia="zh-CN"/>
-        </w:rPr>
-      </w:pPr>
-      <w:r>
-        <w:rPr>
-          <w:rFonts w:ascii="Times New Roman" w:eastAsia="宋体" w:hAnsi="Times New Roman" w:cs="Times New Roman"/>
-          <w:spacing w:val="-3"/>
-          <w:sz w:val="24"/>
-          <w:szCs w:val="24"/>
-          <w:lang w:eastAsia="zh-CN"/>
-        </w:rPr>
-        <w:t>注：若投标人为事业单位或其他组织或分支机构，则法定代表人（单位负责人）</w:t>
-      </w:r>
-      <w:r>
-        <w:rPr>
-          <w:rFonts w:ascii="Times New Roman" w:eastAsia="宋体" w:hAnsi="Times New Roman" w:cs="Times New Roman"/>
-          <w:spacing w:val="-2"/>
-          <w:sz w:val="24"/>
-          <w:szCs w:val="24"/>
-          <w:lang w:eastAsia="zh-CN"/>
-        </w:rPr>
-        <w:t>处的签署人可为单位负责人。</w:t>
-      </w:r>
     </w:p>
     <w:p>
       <w:pPr>
@@ -29347,8 +29205,8 @@
           <w:lang w:eastAsia="zh-CN"/>
         </w:rPr>
         <w:sectPr>
-          <w:headerReference w:type="default" r:id="rId31"/>
-          <w:footerReference w:type="default" r:id="rId32"/>
+          <w:headerReference w:type="default" r:id="rId34"/>
+          <w:footerReference w:type="default" r:id="rId35"/>
           <w:type w:val="continuous"/>
           <w:pgSz w:w="11906" w:h="16839"/>
           <w:pgMar w:top="1440" w:right="1800" w:bottom="1440" w:left="1800" w:header="1090" w:footer="932" w:gutter="0"/>
@@ -29730,8 +29588,8 @@
           <w:lang w:eastAsia="zh-CN"/>
         </w:rPr>
         <w:sectPr>
-          <w:headerReference w:type="default" r:id="rId33"/>
-          <w:footerReference w:type="default" r:id="rId34"/>
+          <w:headerReference w:type="default" r:id="rId36"/>
+          <w:footerReference w:type="default" r:id="rId37"/>
           <w:type w:val="continuous"/>
           <w:pgSz w:w="11906" w:h="16839"/>
           <w:pgMar w:top="1440" w:right="1800" w:bottom="1440" w:left="1800" w:header="1090" w:footer="932" w:gutter="0"/>
@@ -29957,8 +29815,8 @@
           <w:lang w:eastAsia="zh-CN"/>
         </w:rPr>
         <w:sectPr>
-          <w:headerReference w:type="default" r:id="rId35"/>
-          <w:footerReference w:type="default" r:id="rId36"/>
+          <w:headerReference w:type="default" r:id="rId38"/>
+          <w:footerReference w:type="default" r:id="rId39"/>
           <w:type w:val="continuous"/>
           <w:pgSz w:w="11907" w:h="16840"/>
           <w:pgMar w:top="1440" w:right="1800" w:bottom="1440" w:left="1800" w:header="0" w:footer="818" w:gutter="0"/>
@@ -31072,7 +30930,7 @@
           <w:lang w:eastAsia="zh-CN"/>
         </w:rPr>
         <w:sectPr>
-          <w:footerReference w:type="default" r:id="rId37"/>
+          <w:footerReference w:type="default" r:id="rId40"/>
           <w:type w:val="continuous"/>
           <w:pgSz w:w="11907" w:h="16840"/>
           <w:pgMar w:top="1440" w:right="1800" w:bottom="1440" w:left="1800" w:header="0" w:footer="818" w:gutter="0"/>
@@ -31198,8 +31056,8 @@
           <w:lang w:eastAsia="zh-CN"/>
         </w:rPr>
         <w:sectPr>
-          <w:headerReference w:type="default" r:id="rId38"/>
-          <w:footerReference w:type="default" r:id="rId39"/>
+          <w:headerReference w:type="default" r:id="rId41"/>
+          <w:footerReference w:type="default" r:id="rId42"/>
           <w:type w:val="continuous"/>
           <w:pgSz w:w="11907" w:h="16840"/>
           <w:pgMar w:top="1440" w:right="1800" w:bottom="1440" w:left="1800" w:header="862" w:footer="886" w:gutter="0"/>
@@ -31290,8 +31148,8 @@
       </w:pPr>
     </w:p>
     <w:sectPr>
-      <w:headerReference w:type="default" r:id="rId40"/>
-      <w:footerReference w:type="default" r:id="rId41"/>
+      <w:headerReference w:type="default" r:id="rId43"/>
+      <w:footerReference w:type="default" r:id="rId44"/>
       <w:type w:val="continuous"/>
       <w:pgSz w:w="11907" w:h="16840"/>
       <w:pgMar w:top="1440" w:right="1800" w:bottom="1440" w:left="1800" w:header="862" w:footer="886" w:gutter="0"/>
@@ -36934,10 +36792,6 @@
 </file>
 
 <file path=customXml/item1.xml><?xml version="1.0" encoding="utf-8"?>
-<b:Sources xmlns:b="http://schemas.openxmlformats.org/officeDocument/2006/bibliography" xmlns="http://schemas.openxmlformats.org/officeDocument/2006/bibliography" StyleName="APA" SelectedStyle="\APASixthEditionOfficeOnline.xsl" Version="6"/>
-</file>
-
-<file path=customXml/item2.xml><?xml version="1.0" encoding="utf-8"?>
 <s:customData xmlns="http://www.wps.cn/officeDocument/2013/wpsCustomData" xmlns:s="http://www.wps.cn/officeDocument/2013/wpsCustomData">
   <customSectProps>
     <customSectPr/>
@@ -36966,18 +36820,22 @@
 </s:customData>
 </file>
 
+<file path=customXml/item2.xml><?xml version="1.0" encoding="utf-8"?>
+<b:Sources xmlns:b="http://schemas.openxmlformats.org/officeDocument/2006/bibliography" xmlns="http://schemas.openxmlformats.org/officeDocument/2006/bibliography" StyleName="APA" SelectedStyle="\APASixthEditionOfficeOnline.xsl" Version="6"/>
+</file>
+
 <file path=customXml/itemProps1.xml><?xml version="1.0" encoding="utf-8"?>
+<ds:datastoreItem xmlns:ds="http://schemas.openxmlformats.org/officeDocument/2006/customXml" ds:itemID="{B1977F7D-205B-4081-913C-38D41E755F92}">
+  <ds:schemaRefs>
+    <ds:schemaRef ds:uri="http://www.wps.cn/officeDocument/2013/wpsCustomData"/>
+  </ds:schemaRefs>
+</ds:datastoreItem>
+</file>
+
+<file path=customXml/itemProps2.xml><?xml version="1.0" encoding="utf-8"?>
 <ds:datastoreItem xmlns:ds="http://schemas.openxmlformats.org/officeDocument/2006/customXml" ds:itemID="{2FE532E8-B0D3-4EEA-99A1-D7CCF48D3A70}">
   <ds:schemaRefs>
     <ds:schemaRef ds:uri="http://schemas.openxmlformats.org/officeDocument/2006/bibliography"/>
   </ds:schemaRefs>
 </ds:datastoreItem>
-</file>
-
-<file path=customXml/itemProps2.xml><?xml version="1.0" encoding="utf-8"?>
-<ds:datastoreItem xmlns:ds="http://schemas.openxmlformats.org/officeDocument/2006/customXml" ds:itemID="{B1977F7D-205B-4081-913C-38D41E755F92}">
-  <ds:schemaRefs>
-    <ds:schemaRef ds:uri="http://www.wps.cn/officeDocument/2013/wpsCustomData"/>
-  </ds:schemaRefs>
-</ds:datastoreItem>
 </file>
</xml_diff>